<commit_message>
Rebuild the design document Word file
Co-Authored-By: Claude Opus 5.5 <noreply@anthropic.com>
</commit_message>
<xml_diff>
--- a/docs/The Fourth Estate - Game Design Document.docx
+++ b/docs/The Fourth Estate - Game Design Document.docx
@@ -3155,7 +3155,7 @@
               <w:spacing w:after="0"/>
             </w:pPr>
             <w:r>
-              <w:t>Three drop zones: the States candidate (oxblood), the counting house where stories are buried (labelled "Cash in" on screen today), the Nation candidate (federal blue); drag a story, or tap it then tap a zone</w:t>
+              <w:t>Three drop zones: the States candidate (oxblood), "Bury it", where stories are killed for their profit, the Nation candidate (federal blue); drag a story, or tap it then tap a zone</w:t>
             </w:r>
           </w:p>
         </w:tc>
@@ -3354,23 +3354,6 @@
     <w:p>
       <w:r>
         <w:t>The biggest open question is whether the Patronage should be fought over more; everything else is refinement.</w:t>
-      </w:r>
-    </w:p>
-    <w:p>
-      <w:pPr>
-        <w:pStyle w:val="ListBullet"/>
-      </w:pPr>
-      <w:r>
-        <w:t xml:space="preserve">☐ </w:t>
-      </w:r>
-      <w:r>
-        <w:rPr>
-          <w:b/>
-        </w:rPr>
-        <w:t>Story language on screen.</w:t>
-      </w:r>
-      <w:r>
-        <w:t xml:space="preserve"> Carry run positive / run negative / bury into the game itself, which still says "clippings" and "Cash in".</w:t>
       </w:r>
     </w:p>
     <w:p>

</xml_diff>